<commit_message>
v4.10.0: Atualizacao de enderecamentos_padrao - Scratch scripts para inspecao e smoke test de templates - Bump versao para 4.10.0
</commit_message>
<xml_diff>
--- a/ender/enderecamentos_padrao.docx
+++ b/ender/enderecamentos_padrao.docx
@@ -1,93 +1,1500 @@
 
 <file path=word/document.xml><?xml version="1.0" encoding="utf-8"?>
-<w:document xmlns:wpc="http://schemas.microsoft.com/office/word/2010/wordprocessingCanvas" xmlns:cx="http://schemas.microsoft.com/office/drawing/2014/chartex" xmlns:cx1="http://schemas.microsoft.com/office/drawing/2015/9/8/chartex" xmlns:cx2="http://schemas.microsoft.com/office/drawing/2015/10/21/chartex" xmlns:cx3="http://schemas.microsoft.com/office/drawing/2016/5/9/chartex" xmlns:cx4="http://schemas.microsoft.com/office/drawing/2016/5/10/chartex" xmlns:cx5="http://schemas.microsoft.com/office/drawing/2016/5/11/chartex" xmlns:cx6="http://schemas.microsoft.com/office/drawing/2016/5/12/chartex" xmlns:cx7="http://schemas.microsoft.com/office/drawing/2016/5/13/chartex" xmlns:cx8="http://schemas.microsoft.com/office/drawing/2016/5/14/chartex" xmlns:mc="http://schemas.openxmlformats.org/markup-compatibility/2006" xmlns:aink="http://schemas.microsoft.com/office/drawing/2016/ink" xmlns:am3d="http://schemas.microsoft.com/office/drawing/2017/model3d" xmlns:o="urn:schemas-microsoft-com:office:office" xmlns:oel="http://schemas.microsoft.com/office/2019/extlst" xmlns:r="http://schemas.openxmlformats.org/officeDocument/2006/relationships" xmlns:m="http://schemas.openxmlformats.org/officeDocument/2006/math" xmlns:v="urn:schemas-microsoft-com:vml" xmlns:wp14="http://schemas.microsoft.com/office/word/2010/wordprocessingDrawing" xmlns:wp="http://schemas.openxmlformats.org/drawingml/2006/wordprocessingDrawing" xmlns:w10="urn:schemas-microsoft-com:office:word" xmlns:w="http://schemas.openxmlformats.org/wordprocessingml/2006/main" xmlns:w14="http://schemas.microsoft.com/office/word/2010/wordml" xmlns:w15="http://schemas.microsoft.com/office/word/2012/wordml" xmlns:w16cex="http://schemas.microsoft.com/office/word/2018/wordml/cex" xmlns:w16cid="http://schemas.microsoft.com/office/word/2016/wordml/cid" xmlns:w16="http://schemas.microsoft.com/office/word/2018/wordml" xmlns:w16du="http://schemas.microsoft.com/office/word/2023/wordml/word16du" xmlns:w16sdtdh="http://schemas.microsoft.com/office/word/2020/wordml/sdtdatahash" xmlns:w16sdtfl="http://schemas.microsoft.com/office/word/2024/wordml/sdtformatlock" xmlns:w16se="http://schemas.microsoft.com/office/word/2015/wordml/symex" xmlns:wpg="http://schemas.microsoft.com/office/word/2010/wordprocessingGroup" xmlns:wpi="http://schemas.microsoft.com/office/word/2010/wordprocessingInk" xmlns:wne="http://schemas.microsoft.com/office/word/2006/wordml" xmlns:wps="http://schemas.microsoft.com/office/word/2010/wordprocessingShape" mc:Ignorable="w14 w15 w16se w16cid w16 w16cex w16sdtdh w16sdtfl w16du wp14">
+<w:document xmlns:wpc="http://schemas.microsoft.com/office/word/2010/wordprocessingCanvas" xmlns:cx="http://schemas.microsoft.com/office/drawing/2014/chartex" xmlns:cx1="http://schemas.microsoft.com/office/drawing/2015/9/8/chartex" xmlns:cx2="http://schemas.microsoft.com/office/drawing/2015/10/21/chartex" xmlns:cx3="http://schemas.microsoft.com/office/drawing/2016/5/9/chartex" xmlns:cx4="http://schemas.microsoft.com/office/drawing/2016/5/10/chartex" xmlns:cx5="http://schemas.microsoft.com/office/drawing/2016/5/11/chartex" xmlns:cx6="http://schemas.microsoft.com/office/drawing/2016/5/12/chartex" xmlns:cx7="http://schemas.microsoft.com/office/drawing/2016/5/13/chartex" xmlns:cx8="http://schemas.microsoft.com/office/drawing/2016/5/14/chartex" xmlns:mc="http://schemas.openxmlformats.org/markup-compatibility/2006" xmlns:aink="http://schemas.microsoft.com/office/drawing/2016/ink" xmlns:am3d="http://schemas.microsoft.com/office/drawing/2017/model3d" xmlns:o="urn:schemas-microsoft-com:office:office" xmlns:oel="http://schemas.microsoft.com/office/2019/extlst" xmlns:r="http://schemas.openxmlformats.org/officeDocument/2006/relationships" xmlns:m="http://schemas.openxmlformats.org/officeDocument/2006/math" xmlns:v="urn:schemas-microsoft-com:vml" xmlns:wp14="http://schemas.microsoft.com/office/word/2010/wordprocessingDrawing" xmlns:wp="http://schemas.openxmlformats.org/drawingml/2006/wordprocessingDrawing" xmlns:w10="urn:schemas-microsoft-com:office:word" xmlns:w="http://schemas.openxmlformats.org/wordprocessingml/2006/main" xmlns:w14="http://schemas.microsoft.com/office/word/2010/wordml" xmlns:w15="http://schemas.microsoft.com/office/word/2012/wordml" xmlns:w16cei="http://schemas.microsoft.com/office/word/2026/wordml/cei" xmlns:w16cex="http://schemas.microsoft.com/office/word/2018/wordml/cex" xmlns:w16cid="http://schemas.microsoft.com/office/word/2016/wordml/cid" xmlns:w16="http://schemas.microsoft.com/office/word/2018/wordml" xmlns:w16du="http://schemas.microsoft.com/office/word/2023/wordml/word16du" xmlns:w16sdtdh="http://schemas.microsoft.com/office/word/2020/wordml/sdtdatahash" xmlns:w16sdtfl="http://schemas.microsoft.com/office/word/2024/wordml/sdtformatlock" xmlns:w16se="http://schemas.microsoft.com/office/word/2015/wordml/symex" xmlns:wpg="http://schemas.microsoft.com/office/word/2010/wordprocessingGroup" xmlns:wpi="http://schemas.microsoft.com/office/word/2010/wordprocessingInk" xmlns:wne="http://schemas.microsoft.com/office/word/2006/wordml" xmlns:wps="http://schemas.microsoft.com/office/word/2010/wordprocessingShape" mc:Ignorable="w14 w15 w16se w16cid w16 w16cex w16sdtdh w16sdtfl w16du wp14">
   <w:body>
     <w:p>
       <w:pPr>
-        <w:spacing w:after="0" w:line="240" w:lineRule="auto"/>
-        <w:rPr>
+        <w:spacing w:after="0" w:line="276" w:lineRule="auto"/>
+        <w:jc w:val="both"/>
+        <w:rPr>
+          <w:rFonts w:eastAsia="MS Mincho" w:cs="Arial"/>
+          <w:kern w:val="0"/>
+          <w:szCs w:val="22"/>
+          <w14:ligatures w14:val="none"/>
+        </w:rPr>
+      </w:pPr>
+      <w:bookmarkStart w:id="0" w:name="_Hlk219292174"/>
+      <w:bookmarkStart w:id="1" w:name="_Hlk219292401"/>
+      <w:r>
+        <w:rPr>
+          <w:rFonts w:eastAsia="MS Mincho" w:cs="Arial"/>
+          <w:kern w:val="0"/>
+          <w:szCs w:val="22"/>
+          <w14:ligatures w14:val="none"/>
+        </w:rPr>
+        <w:t>Ao Senhor</w:t>
+      </w:r>
+    </w:p>
+    <w:p>
+      <w:pPr>
+        <w:spacing w:after="0" w:line="276" w:lineRule="auto"/>
+        <w:jc w:val="both"/>
+        <w:rPr>
+          <w:rFonts w:eastAsia="MS Mincho" w:cs="Arial"/>
+          <w:b/>
+          <w:bCs/>
+          <w:kern w:val="0"/>
+          <w:szCs w:val="22"/>
+          <w14:ligatures w14:val="none"/>
+        </w:rPr>
+      </w:pPr>
+      <w:r>
+        <w:rPr>
+          <w:rFonts w:eastAsia="MS Mincho" w:cs="Arial"/>
+          <w:b/>
+          <w:bCs/>
+          <w:kern w:val="0"/>
+          <w:szCs w:val="22"/>
+          <w14:ligatures w14:val="none"/>
+        </w:rPr>
+        <w:t>HAROLDO RAMOS TEIXEIRA</w:t>
+      </w:r>
+    </w:p>
+    <w:p>
+      <w:pPr>
+        <w:spacing w:after="0" w:line="276" w:lineRule="auto"/>
+        <w:jc w:val="both"/>
+        <w:rPr>
+          <w:rFonts w:eastAsia="MS Mincho" w:cs="Arial"/>
+          <w:b/>
+          <w:bCs/>
+          <w:kern w:val="0"/>
+          <w:szCs w:val="22"/>
+          <w14:ligatures w14:val="none"/>
+        </w:rPr>
+      </w:pPr>
+      <w:r>
+        <w:rPr>
+          <w:rFonts w:eastAsia="MS Mincho" w:cs="Arial"/>
+          <w:b/>
+          <w:bCs/>
+          <w:kern w:val="0"/>
+          <w:szCs w:val="22"/>
+          <w14:ligatures w14:val="none"/>
+        </w:rPr>
+        <w:t>Coordenador Dirigente Regional de Ensino</w:t>
+      </w:r>
+    </w:p>
+    <w:p>
+      <w:pPr>
+        <w:spacing w:after="0" w:line="276" w:lineRule="auto"/>
+        <w:jc w:val="both"/>
+        <w:rPr>
+          <w:rFonts w:eastAsia="MS Mincho" w:cs="Arial"/>
+          <w:b/>
+          <w:bCs/>
+          <w:kern w:val="0"/>
+          <w:szCs w:val="22"/>
+          <w14:ligatures w14:val="none"/>
+        </w:rPr>
+      </w:pPr>
+      <w:r>
+        <w:rPr>
+          <w:rFonts w:eastAsia="MS Mincho" w:cs="Arial"/>
+          <w:b/>
+          <w:bCs/>
+          <w:kern w:val="0"/>
+          <w:szCs w:val="22"/>
+          <w14:ligatures w14:val="none"/>
+        </w:rPr>
+        <w:t>Unidade Regional de Ensino – Região de Americana</w:t>
+      </w:r>
+    </w:p>
+    <w:p>
+      <w:pPr>
+        <w:keepLines/>
+        <w:spacing w:after="0" w:line="240" w:lineRule="auto"/>
+        <w:rPr>
+          <w:rFonts w:eastAsia="Times New Roman" w:cs="Arial"/>
+          <w:color w:val="000000"/>
+          <w:kern w:val="0"/>
+          <w:u w:val="single"/>
           <w:lang w:eastAsia="pt-BR"/>
-        </w:rPr>
-      </w:pPr>
-      <w:r>
-        <w:rPr>
+          <w14:ligatures w14:val="none"/>
+        </w:rPr>
+      </w:pPr>
+      <w:r>
+        <w:rPr>
+          <w:rFonts w:eastAsia="Times New Roman" w:cs="Arial"/>
+          <w:color w:val="000000"/>
+          <w:kern w:val="0"/>
+          <w:u w:val="single"/>
           <w:lang w:eastAsia="pt-BR"/>
-        </w:rPr>
-        <w:t>A Sua Excelência o Senhor</w:t>
-      </w:r>
-    </w:p>
-    <w:p>
-      <w:pPr>
-        <w:spacing w:after="0" w:line="240" w:lineRule="auto"/>
-        <w:rPr>
-          <w:b/>
-          <w:bCs/>
-          <w:lang w:eastAsia="pt-BR"/>
-        </w:rPr>
-      </w:pPr>
-      <w:r>
-        <w:rPr>
-          <w:b/>
-          <w:bCs/>
-          <w:lang w:eastAsia="pt-BR"/>
-        </w:rPr>
-        <w:t>ELEUSES PAIVA</w:t>
-      </w:r>
-    </w:p>
-    <w:p>
-      <w:pPr>
-        <w:spacing w:after="0" w:line="240" w:lineRule="auto"/>
-        <w:rPr>
-          <w:lang w:eastAsia="pt-BR"/>
-        </w:rPr>
-      </w:pPr>
-      <w:r>
-        <w:rPr>
-          <w:lang w:eastAsia="pt-BR"/>
-        </w:rPr>
-        <w:t>Secretário de Saúde do Estado de São Paulo</w:t>
-      </w:r>
-    </w:p>
-    <w:p>
-      <w:pPr>
-        <w:spacing w:after="0" w:line="240" w:lineRule="auto"/>
-        <w:rPr>
-          <w:lang w:eastAsia="pt-BR"/>
-        </w:rPr>
-      </w:pPr>
-      <w:r>
-        <w:rPr>
-          <w:lang w:eastAsia="pt-BR"/>
-        </w:rPr>
-        <w:t>Avenida Dr. Eneas Carvalho de Aguiar, nº 188 – Cerqueira César</w:t>
-      </w:r>
-    </w:p>
-    <w:p>
-      <w:pPr>
-        <w:spacing w:after="0" w:line="240" w:lineRule="auto"/>
-        <w:rPr>
-          <w:lang w:eastAsia="pt-BR"/>
-        </w:rPr>
-      </w:pPr>
-      <w:r>
-        <w:rPr>
-          <w:lang w:eastAsia="pt-BR"/>
-        </w:rPr>
-        <w:t>CEP 05403-000 – São Paulo/SP</w:t>
-      </w:r>
-    </w:p>
-    <w:p>
-      <w:pPr>
-        <w:spacing w:after="0" w:line="240" w:lineRule="auto"/>
-        <w:rPr>
-          <w:lang w:eastAsia="pt-BR"/>
+          <w14:ligatures w14:val="none"/>
+        </w:rPr>
+        <w:t>Rua Duque de Caxias, nº 600 – Vila Santa Catarina</w:t>
+      </w:r>
+    </w:p>
+    <w:p>
+      <w:pPr>
+        <w:keepLines/>
+        <w:spacing w:after="0" w:line="240" w:lineRule="auto"/>
+        <w:rPr>
+          <w:rFonts w:eastAsia="Times New Roman" w:cs="Arial"/>
+          <w:color w:val="000000"/>
+          <w:kern w:val="0"/>
+          <w:lang w:val="en-US" w:eastAsia="pt-BR"/>
+          <w14:ligatures w14:val="none"/>
+        </w:rPr>
+      </w:pPr>
+      <w:r>
+        <w:rPr>
+          <w:rFonts w:eastAsia="Times New Roman" w:cs="Arial"/>
+          <w:color w:val="000000"/>
+          <w:kern w:val="0"/>
+          <w:lang w:val="en-US" w:eastAsia="pt-BR"/>
+          <w14:ligatures w14:val="none"/>
+        </w:rPr>
+        <w:t>CEP: 13466-320 – Americana/SP</w:t>
+      </w:r>
+    </w:p>
+    <w:p>
+      <w:pPr>
+        <w:keepLines/>
+        <w:spacing w:after="0" w:line="240" w:lineRule="auto"/>
+        <w:rPr>
+          <w:rFonts w:eastAsia="Times New Roman" w:cs="Arial"/>
+          <w:color w:val="000000"/>
+          <w:kern w:val="0"/>
+          <w:u w:val="single"/>
+          <w:lang w:val="en-US" w:eastAsia="pt-BR"/>
+          <w14:ligatures w14:val="none"/>
         </w:rPr>
       </w:pPr>
       <w:hyperlink r:id="rId4" w:history="1">
         <w:r>
           <w:rPr>
-            <w:rStyle w:val="Hyperlink"/>
-            <w:lang w:eastAsia="pt-BR"/>
+            <w:rFonts w:eastAsia="Times New Roman" w:cs="Arial"/>
+            <w:color w:val="0000FF"/>
+            <w:kern w:val="0"/>
+            <w:u w:val="single"/>
+            <w:lang w:val="en-US" w:eastAsia="pt-BR"/>
+            <w14:ligatures w14:val="none"/>
+          </w:rPr>
+          <w:t>deame@educacao.sp.gov.br</w:t>
+        </w:r>
+      </w:hyperlink>
+    </w:p>
+    <w:p>
+      <w:pPr>
+        <w:keepLines/>
+        <w:spacing w:after="0" w:line="240" w:lineRule="auto"/>
+        <w:rPr>
+          <w:rFonts w:eastAsia="Times New Roman" w:cs="Arial"/>
+          <w:snapToGrid w:val="0"/>
+          <w:color w:val="000000"/>
+          <w:kern w:val="0"/>
+          <w:u w:val="single"/>
+          <w:lang w:val="en-US" w:eastAsia="pt-BR"/>
+          <w14:ligatures w14:val="none"/>
+        </w:rPr>
+      </w:pPr>
+    </w:p>
+    <w:p>
+      <w:pPr>
+        <w:spacing w:after="0" w:line="276" w:lineRule="auto"/>
+        <w:jc w:val="both"/>
+        <w:rPr>
+          <w:rFonts w:eastAsia="MS Mincho" w:cs="Arial"/>
+          <w:kern w:val="0"/>
+          <w:szCs w:val="22"/>
+          <w14:ligatures w14:val="none"/>
+        </w:rPr>
+      </w:pPr>
+      <w:r>
+        <w:rPr>
+          <w:rFonts w:eastAsia="MS Mincho" w:cs="Arial"/>
+          <w:kern w:val="0"/>
+          <w:szCs w:val="22"/>
+          <w14:ligatures w14:val="none"/>
+        </w:rPr>
+        <w:t>À</w:t>
+      </w:r>
+    </w:p>
+    <w:p>
+      <w:pPr>
+        <w:spacing w:after="0" w:line="276" w:lineRule="auto"/>
+        <w:jc w:val="both"/>
+        <w:rPr>
+          <w:rFonts w:eastAsia="MS Mincho" w:cs="Arial"/>
+          <w:b/>
+          <w:bCs/>
+          <w:kern w:val="0"/>
+          <w:szCs w:val="22"/>
+          <w14:ligatures w14:val="none"/>
+        </w:rPr>
+      </w:pPr>
+      <w:r>
+        <w:rPr>
+          <w:rFonts w:eastAsia="MS Mincho" w:cs="Arial"/>
+          <w:b/>
+          <w:bCs/>
+          <w:kern w:val="0"/>
+          <w:szCs w:val="22"/>
+          <w14:ligatures w14:val="none"/>
+        </w:rPr>
+        <w:t>NEOENERGIA ELEKTRO</w:t>
+      </w:r>
+    </w:p>
+    <w:p>
+      <w:pPr>
+        <w:keepLines/>
+        <w:spacing w:after="0" w:line="240" w:lineRule="auto"/>
+        <w:rPr>
+          <w:rFonts w:eastAsia="Times New Roman" w:cs="Arial"/>
+          <w:snapToGrid w:val="0"/>
+          <w:color w:val="000000"/>
+          <w:kern w:val="0"/>
+          <w:u w:val="single"/>
+          <w:lang w:eastAsia="pt-BR"/>
+          <w14:ligatures w14:val="none"/>
+        </w:rPr>
+      </w:pPr>
+      <w:r>
+        <w:rPr>
+          <w:rFonts w:eastAsia="Times New Roman" w:cs="Arial"/>
+          <w:snapToGrid w:val="0"/>
+          <w:color w:val="000000"/>
+          <w:kern w:val="0"/>
+          <w:u w:val="single"/>
+          <w:lang w:eastAsia="pt-BR"/>
+          <w14:ligatures w14:val="none"/>
+        </w:rPr>
+        <w:t>Rua Ary Antenor de Souza, nº 321 – Jardim Nova América</w:t>
+      </w:r>
+    </w:p>
+    <w:p>
+      <w:pPr>
+        <w:keepLines/>
+        <w:spacing w:after="0" w:line="240" w:lineRule="auto"/>
+        <w:rPr>
+          <w:rFonts w:eastAsia="Times New Roman" w:cs="Arial"/>
+          <w:color w:val="000000"/>
+          <w:kern w:val="0"/>
+          <w:lang w:eastAsia="pt-BR"/>
+          <w14:ligatures w14:val="none"/>
+        </w:rPr>
+      </w:pPr>
+      <w:r>
+        <w:rPr>
+          <w:rFonts w:eastAsia="Times New Roman" w:cs="Arial"/>
+          <w:snapToGrid w:val="0"/>
+          <w:color w:val="000000"/>
+          <w:kern w:val="0"/>
+          <w:lang w:eastAsia="pt-BR"/>
+          <w14:ligatures w14:val="none"/>
+        </w:rPr>
+        <w:t>CEP: 13053-024 – Campinas/SP</w:t>
+      </w:r>
+    </w:p>
+    <w:p>
+      <w:pPr>
+        <w:keepLines/>
+        <w:spacing w:after="0" w:line="240" w:lineRule="auto"/>
+        <w:rPr>
+          <w:rFonts w:eastAsia="Times New Roman" w:cs="Arial"/>
+          <w:snapToGrid w:val="0"/>
+          <w:color w:val="000000"/>
+          <w:kern w:val="0"/>
+          <w:u w:val="single"/>
+          <w:lang w:eastAsia="pt-BR"/>
+          <w14:ligatures w14:val="none"/>
+        </w:rPr>
+      </w:pPr>
+    </w:p>
+    <w:p>
+      <w:pPr>
+        <w:spacing w:after="0" w:line="276" w:lineRule="auto"/>
+        <w:jc w:val="both"/>
+        <w:rPr>
+          <w:rFonts w:eastAsia="MS Mincho" w:cs="Arial"/>
+          <w:kern w:val="0"/>
+          <w:szCs w:val="22"/>
+          <w14:ligatures w14:val="none"/>
+        </w:rPr>
+      </w:pPr>
+      <w:r>
+        <w:rPr>
+          <w:rFonts w:eastAsia="MS Mincho" w:cs="Arial"/>
+          <w:kern w:val="0"/>
+          <w:szCs w:val="22"/>
+          <w14:ligatures w14:val="none"/>
+        </w:rPr>
+        <w:t>À</w:t>
+      </w:r>
+    </w:p>
+    <w:bookmarkEnd w:id="0"/>
+    <w:bookmarkEnd w:id="1"/>
+    <w:p>
+      <w:pPr>
+        <w:spacing w:after="0" w:line="276" w:lineRule="auto"/>
+        <w:jc w:val="both"/>
+        <w:rPr>
+          <w:rFonts w:eastAsia="MS Mincho" w:cs="Arial"/>
+          <w:b/>
+          <w:bCs/>
+          <w:kern w:val="0"/>
+          <w:szCs w:val="22"/>
+          <w14:ligatures w14:val="none"/>
+        </w:rPr>
+      </w:pPr>
+      <w:r>
+        <w:rPr>
+          <w:rFonts w:eastAsia="MS Mincho" w:cs="Arial"/>
+          <w:b/>
+          <w:bCs/>
+          <w:kern w:val="0"/>
+          <w:szCs w:val="22"/>
+          <w14:ligatures w14:val="none"/>
+        </w:rPr>
+        <w:t>AGÊNCIA NACIONAL DE ENERGIA ELÉTRICA – ANEEL</w:t>
+      </w:r>
+    </w:p>
+    <w:p>
+      <w:pPr>
+        <w:keepLines/>
+        <w:spacing w:after="0" w:line="240" w:lineRule="auto"/>
+        <w:rPr>
+          <w:rFonts w:eastAsia="Times New Roman" w:cs="Arial"/>
+          <w:snapToGrid w:val="0"/>
+          <w:color w:val="000000"/>
+          <w:kern w:val="0"/>
+          <w:u w:val="single"/>
+          <w:lang w:eastAsia="pt-BR"/>
+          <w14:ligatures w14:val="none"/>
+        </w:rPr>
+      </w:pPr>
+      <w:r>
+        <w:rPr>
+          <w:rFonts w:eastAsia="Times New Roman" w:cs="Arial"/>
+          <w:snapToGrid w:val="0"/>
+          <w:color w:val="000000"/>
+          <w:kern w:val="0"/>
+          <w:u w:val="single"/>
+          <w:lang w:eastAsia="pt-BR"/>
+          <w14:ligatures w14:val="none"/>
+        </w:rPr>
+        <w:t>SGAN 603 –</w:t>
+      </w:r>
+      <w:r>
+        <w:rPr>
+          <w:rFonts w:eastAsia="Times New Roman" w:cs="Arial"/>
+          <w:snapToGrid w:val="0"/>
+          <w:color w:val="000000"/>
+          <w:kern w:val="0"/>
+          <w:u w:val="single"/>
+          <w:lang w:eastAsia="pt-BR"/>
+          <w14:ligatures w14:val="none"/>
+        </w:rPr>
+        <w:t xml:space="preserve"> </w:t>
+      </w:r>
+      <w:r>
+        <w:rPr>
+          <w:rFonts w:eastAsia="Times New Roman" w:cs="Arial"/>
+          <w:snapToGrid w:val="0"/>
+          <w:color w:val="000000"/>
+          <w:kern w:val="0"/>
+          <w:u w:val="single"/>
+          <w:lang w:eastAsia="pt-BR"/>
+          <w14:ligatures w14:val="none"/>
+        </w:rPr>
+        <w:t>Térreo</w:t>
+      </w:r>
+    </w:p>
+    <w:p>
+      <w:pPr>
+        <w:keepLines/>
+        <w:spacing w:after="0" w:line="240" w:lineRule="auto"/>
+        <w:rPr>
+          <w:rFonts w:eastAsia="Times New Roman" w:cs="Arial"/>
+          <w:color w:val="000000"/>
+          <w:kern w:val="0"/>
+          <w:lang w:eastAsia="pt-BR"/>
+          <w14:ligatures w14:val="none"/>
+        </w:rPr>
+      </w:pPr>
+      <w:r>
+        <w:rPr>
+          <w:rFonts w:eastAsia="Times New Roman" w:cs="Arial"/>
+          <w:snapToGrid w:val="0"/>
+          <w:color w:val="000000"/>
+          <w:kern w:val="0"/>
+          <w:lang w:eastAsia="pt-BR"/>
+          <w14:ligatures w14:val="none"/>
+        </w:rPr>
+        <w:t>CEP: 70830-110 – Brasília/DF</w:t>
+      </w:r>
+    </w:p>
+    <w:p>
+      <w:pPr>
+        <w:spacing w:after="0" w:line="276" w:lineRule="auto"/>
+        <w:jc w:val="both"/>
+        <w:rPr>
+          <w:rFonts w:eastAsia="MS Mincho" w:cs="Arial"/>
+          <w:b/>
+          <w:bCs/>
+          <w:kern w:val="0"/>
+          <w:szCs w:val="22"/>
+          <w14:ligatures w14:val="none"/>
+        </w:rPr>
+      </w:pPr>
+    </w:p>
+    <w:p>
+      <w:pPr>
+        <w:spacing w:after="0" w:line="276" w:lineRule="auto"/>
+        <w:jc w:val="both"/>
+        <w:rPr>
+          <w:rFonts w:eastAsia="MS Mincho" w:cs="Arial"/>
+          <w:kern w:val="0"/>
+          <w:szCs w:val="22"/>
+          <w14:ligatures w14:val="none"/>
+        </w:rPr>
+      </w:pPr>
+      <w:r>
+        <w:rPr>
+          <w:rFonts w:eastAsia="MS Mincho" w:cs="Arial"/>
+          <w:kern w:val="0"/>
+          <w:szCs w:val="22"/>
+          <w14:ligatures w14:val="none"/>
+        </w:rPr>
+        <w:t>Ao</w:t>
+      </w:r>
+    </w:p>
+    <w:p>
+      <w:pPr>
+        <w:spacing w:after="0" w:line="276" w:lineRule="auto"/>
+        <w:jc w:val="both"/>
+        <w:rPr>
+          <w:rFonts w:eastAsia="MS Mincho" w:cs="Arial"/>
+          <w:b/>
+          <w:bCs/>
+          <w:kern w:val="0"/>
+          <w:szCs w:val="22"/>
+          <w14:ligatures w14:val="none"/>
+        </w:rPr>
+      </w:pPr>
+      <w:r>
+        <w:rPr>
+          <w:rFonts w:eastAsia="MS Mincho" w:cs="Arial"/>
+          <w:b/>
+          <w:bCs/>
+          <w:kern w:val="0"/>
+          <w:szCs w:val="22"/>
+          <w14:ligatures w14:val="none"/>
+        </w:rPr>
+        <w:t xml:space="preserve">DER – DEPARTAMENTO DE ESTRADAS DE RODAGEM </w:t>
+      </w:r>
+    </w:p>
+    <w:p>
+      <w:pPr>
+        <w:spacing w:after="0" w:line="276" w:lineRule="auto"/>
+        <w:jc w:val="both"/>
+        <w:rPr>
+          <w:rFonts w:eastAsia="MS Mincho" w:cs="Arial"/>
+          <w:b/>
+          <w:bCs/>
+          <w:kern w:val="0"/>
+          <w:szCs w:val="22"/>
+          <w14:ligatures w14:val="none"/>
+        </w:rPr>
+      </w:pPr>
+      <w:r>
+        <w:rPr>
+          <w:rFonts w:eastAsia="MS Mincho" w:cs="Arial"/>
+          <w:b/>
+          <w:bCs/>
+          <w:kern w:val="0"/>
+          <w:szCs w:val="22"/>
+          <w14:ligatures w14:val="none"/>
+        </w:rPr>
+        <w:t>DO ESTADO DE SÃO PAULO</w:t>
+      </w:r>
+    </w:p>
+    <w:p>
+      <w:pPr>
+        <w:spacing w:after="0" w:line="276" w:lineRule="auto"/>
+        <w:jc w:val="both"/>
+        <w:rPr>
+          <w:rFonts w:eastAsia="MS Mincho" w:cs="Arial"/>
+          <w:b/>
+          <w:bCs/>
+          <w:kern w:val="0"/>
+          <w:szCs w:val="22"/>
+          <w14:ligatures w14:val="none"/>
+        </w:rPr>
+      </w:pPr>
+      <w:r>
+        <w:rPr>
+          <w:rFonts w:eastAsia="MS Mincho" w:cs="Arial"/>
+          <w:b/>
+          <w:bCs/>
+          <w:kern w:val="0"/>
+          <w:szCs w:val="22"/>
+          <w14:ligatures w14:val="none"/>
+        </w:rPr>
+        <w:t>CGR 13 – Rio Claro</w:t>
+      </w:r>
+    </w:p>
+    <w:p>
+      <w:pPr>
+        <w:spacing w:after="0" w:line="276" w:lineRule="auto"/>
+        <w:jc w:val="both"/>
+        <w:rPr>
+          <w:rFonts w:eastAsia="MS Mincho" w:cs="Arial"/>
+          <w:kern w:val="0"/>
+          <w:szCs w:val="22"/>
+          <w14:ligatures w14:val="none"/>
+        </w:rPr>
+      </w:pPr>
+      <w:r>
+        <w:rPr>
+          <w:rFonts w:eastAsia="MS Mincho" w:cs="Arial"/>
+          <w:kern w:val="0"/>
+          <w:szCs w:val="22"/>
+          <w14:ligatures w14:val="none"/>
+        </w:rPr>
+        <w:t>Residência 13.2 – Piracicaba</w:t>
+      </w:r>
+    </w:p>
+    <w:p>
+      <w:pPr>
+        <w:keepLines/>
+        <w:spacing w:after="0" w:line="240" w:lineRule="auto"/>
+        <w:rPr>
+          <w:rFonts w:eastAsia="Times New Roman" w:cs="Arial"/>
+          <w:snapToGrid w:val="0"/>
+          <w:color w:val="000000"/>
+          <w:kern w:val="0"/>
+          <w:u w:val="single"/>
+          <w:lang w:eastAsia="pt-BR"/>
+          <w14:ligatures w14:val="none"/>
+        </w:rPr>
+      </w:pPr>
+      <w:r>
+        <w:rPr>
+          <w:rFonts w:eastAsia="Times New Roman" w:cs="Arial"/>
+          <w:snapToGrid w:val="0"/>
+          <w:color w:val="000000"/>
+          <w:kern w:val="0"/>
+          <w:u w:val="single"/>
+          <w:lang w:eastAsia="pt-BR"/>
+          <w14:ligatures w14:val="none"/>
+        </w:rPr>
+        <w:t>Avenida Pádua Dias, nº 515 – Vila Independência</w:t>
+      </w:r>
+    </w:p>
+    <w:p>
+      <w:pPr>
+        <w:keepLines/>
+        <w:spacing w:after="0" w:line="240" w:lineRule="auto"/>
+        <w:rPr>
+          <w:rFonts w:eastAsia="Times New Roman" w:cs="Arial"/>
+          <w:snapToGrid w:val="0"/>
+          <w:color w:val="000000"/>
+          <w:kern w:val="0"/>
+          <w:lang w:val="en-US" w:eastAsia="pt-BR"/>
+          <w14:ligatures w14:val="none"/>
+        </w:rPr>
+      </w:pPr>
+      <w:r>
+        <w:rPr>
+          <w:rFonts w:eastAsia="Times New Roman" w:cs="Arial"/>
+          <w:snapToGrid w:val="0"/>
+          <w:color w:val="000000"/>
+          <w:kern w:val="0"/>
+          <w:lang w:val="en-US" w:eastAsia="pt-BR"/>
+          <w14:ligatures w14:val="none"/>
+        </w:rPr>
+        <w:t>CEP: 13418-260 – Piracicaba/SP</w:t>
+      </w:r>
+    </w:p>
+    <w:p>
+      <w:pPr>
+        <w:spacing w:after="0" w:line="240" w:lineRule="auto"/>
+        <w:jc w:val="both"/>
+        <w:rPr>
+          <w:rFonts w:eastAsia="Times New Roman" w:cs="Arial"/>
+          <w:b/>
+          <w:bCs/>
+          <w:color w:val="000000"/>
+          <w:kern w:val="0"/>
+          <w:u w:val="single"/>
+          <w:lang w:val="en-US" w:eastAsia="pt-BR"/>
+          <w14:ligatures w14:val="none"/>
+        </w:rPr>
+      </w:pPr>
+      <w:hyperlink r:id="rId5" w:history="1">
+        <w:r>
+          <w:rPr>
+            <w:rFonts w:eastAsia="Times New Roman" w:cs="Arial"/>
+            <w:color w:val="0000FF"/>
+            <w:kern w:val="0"/>
+            <w:u w:val="single"/>
+            <w:lang w:val="en-US" w:eastAsia="pt-BR"/>
+            <w14:ligatures w14:val="none"/>
+          </w:rPr>
+          <w:t>rc13.2-der@der.sp.gov.br</w:t>
+        </w:r>
+      </w:hyperlink>
+    </w:p>
+    <w:p>
+      <w:pPr>
+        <w:spacing w:after="0" w:line="276" w:lineRule="auto"/>
+        <w:jc w:val="both"/>
+        <w:rPr>
+          <w:rFonts w:eastAsia="MS Mincho" w:cs="Arial"/>
+          <w:kern w:val="0"/>
+          <w:szCs w:val="22"/>
+          <w:lang w:val="en-US"/>
+          <w14:ligatures w14:val="none"/>
+        </w:rPr>
+      </w:pPr>
+    </w:p>
+    <w:p>
+      <w:pPr>
+        <w:spacing w:after="0" w:line="276" w:lineRule="auto"/>
+        <w:jc w:val="both"/>
+        <w:rPr>
+          <w:rFonts w:eastAsia="MS Mincho" w:cs="Arial"/>
+          <w:kern w:val="0"/>
+          <w:szCs w:val="22"/>
+          <w14:ligatures w14:val="none"/>
+        </w:rPr>
+      </w:pPr>
+      <w:r>
+        <w:rPr>
+          <w:rFonts w:eastAsia="MS Mincho" w:cs="Arial"/>
+          <w:kern w:val="0"/>
+          <w:szCs w:val="22"/>
+          <w14:ligatures w14:val="none"/>
+        </w:rPr>
+        <w:t>Ao Ilustríssimo Senhor</w:t>
+      </w:r>
+    </w:p>
+    <w:p>
+      <w:pPr>
+        <w:spacing w:after="0" w:line="276" w:lineRule="auto"/>
+        <w:jc w:val="both"/>
+        <w:rPr>
+          <w:rFonts w:eastAsia="MS Mincho" w:cs="Arial"/>
+          <w:b/>
+          <w:bCs/>
+          <w:kern w:val="0"/>
+          <w:szCs w:val="22"/>
+          <w14:ligatures w14:val="none"/>
+        </w:rPr>
+      </w:pPr>
+      <w:r>
+        <w:rPr>
+          <w:rFonts w:eastAsia="MS Mincho" w:cs="Arial"/>
+          <w:b/>
+          <w:bCs/>
+          <w:kern w:val="0"/>
+          <w:szCs w:val="22"/>
+          <w14:ligatures w14:val="none"/>
+        </w:rPr>
+        <w:t>COMANDANTE DA GUARDA CIVIL MUNICIPAL</w:t>
+      </w:r>
+    </w:p>
+    <w:p>
+      <w:pPr>
+        <w:spacing w:after="0" w:line="276" w:lineRule="auto"/>
+        <w:jc w:val="both"/>
+        <w:rPr>
+          <w:rFonts w:eastAsia="MS Mincho" w:cs="Arial"/>
+          <w:kern w:val="0"/>
+          <w:szCs w:val="22"/>
+          <w:u w:val="single"/>
+          <w14:ligatures w14:val="none"/>
+        </w:rPr>
+      </w:pPr>
+      <w:r>
+        <w:rPr>
+          <w:rFonts w:eastAsia="MS Mincho" w:cs="Arial"/>
+          <w:kern w:val="0"/>
+          <w:szCs w:val="22"/>
+          <w:u w:val="single"/>
+          <w14:ligatures w14:val="none"/>
+        </w:rPr>
+        <w:t>Rua Curitiba- 259, Jardim Pérola, CEP. 13454-056</w:t>
+      </w:r>
+    </w:p>
+    <w:p>
+      <w:pPr>
+        <w:spacing w:after="0" w:line="240" w:lineRule="auto"/>
+        <w:rPr>
+          <w:rFonts w:eastAsia="Times New Roman" w:cs="Arial"/>
+          <w:color w:val="000000"/>
+          <w:kern w:val="0"/>
+          <w14:ligatures w14:val="none"/>
+        </w:rPr>
+      </w:pPr>
+    </w:p>
+    <w:p>
+      <w:pPr>
+        <w:spacing w:after="0" w:line="240" w:lineRule="auto"/>
+        <w:rPr>
+          <w:rFonts w:eastAsia="Times New Roman" w:cs="Arial"/>
+          <w:color w:val="000000"/>
+          <w:kern w:val="0"/>
+          <w14:ligatures w14:val="none"/>
+        </w:rPr>
+      </w:pPr>
+      <w:r>
+        <w:rPr>
+          <w:rFonts w:eastAsia="Times New Roman" w:cs="Arial"/>
+          <w:color w:val="000000"/>
+          <w:kern w:val="0"/>
+          <w14:ligatures w14:val="none"/>
+        </w:rPr>
+        <w:t>Ao Reverendíssimo Senhor</w:t>
+      </w:r>
+    </w:p>
+    <w:p>
+      <w:pPr>
+        <w:spacing w:after="0" w:line="240" w:lineRule="auto"/>
+        <w:rPr>
+          <w:rFonts w:eastAsia="Times New Roman" w:cs="Arial"/>
+          <w:b/>
+          <w:bCs/>
+          <w:color w:val="000000"/>
+          <w:kern w:val="0"/>
+          <w14:ligatures w14:val="none"/>
+        </w:rPr>
+      </w:pPr>
+      <w:r>
+        <w:rPr>
+          <w:rFonts w:eastAsia="Times New Roman" w:cs="Arial"/>
+          <w:b/>
+          <w:bCs/>
+          <w:color w:val="000000"/>
+          <w:kern w:val="0"/>
+          <w14:ligatures w14:val="none"/>
+        </w:rPr>
+        <w:t>Bispo Adriano Nascimento</w:t>
+      </w:r>
+    </w:p>
+    <w:p>
+      <w:pPr>
+        <w:spacing w:after="0" w:line="240" w:lineRule="auto"/>
+        <w:rPr>
+          <w:rFonts w:eastAsia="Times New Roman" w:cs="Arial"/>
+          <w:b/>
+          <w:bCs/>
+          <w:color w:val="000000"/>
+          <w:kern w:val="0"/>
+          <w14:ligatures w14:val="none"/>
+        </w:rPr>
+      </w:pPr>
+      <w:r>
+        <w:rPr>
+          <w:rFonts w:eastAsia="Times New Roman" w:cs="Arial"/>
+          <w:b/>
+          <w:bCs/>
+          <w:color w:val="000000"/>
+          <w:kern w:val="0"/>
+          <w14:ligatures w14:val="none"/>
+        </w:rPr>
+        <w:t>IGREJA DE NOSSO SENHOR JESUS CRISTO</w:t>
+      </w:r>
+    </w:p>
+    <w:p>
+      <w:pPr>
+        <w:spacing w:after="0" w:line="240" w:lineRule="auto"/>
+        <w:rPr>
+          <w:rFonts w:eastAsia="Times New Roman" w:cs="Arial"/>
+          <w:color w:val="000000"/>
+          <w:kern w:val="0"/>
+          <w:u w:val="single"/>
+          <w14:ligatures w14:val="none"/>
+        </w:rPr>
+      </w:pPr>
+      <w:r>
+        <w:rPr>
+          <w:rFonts w:eastAsia="Times New Roman" w:cs="Arial"/>
+          <w:color w:val="000000"/>
+          <w:kern w:val="0"/>
+          <w:u w:val="single"/>
+          <w14:ligatures w14:val="none"/>
+        </w:rPr>
+        <w:t>Rua Salvador Gomes, 40, Jardim Dona Regina</w:t>
+      </w:r>
+    </w:p>
+    <w:p>
+      <w:pPr>
+        <w:spacing w:after="0" w:line="240" w:lineRule="auto"/>
+        <w:rPr>
+          <w:rFonts w:eastAsia="Times New Roman" w:cs="Arial"/>
+          <w:color w:val="000000"/>
+          <w:kern w:val="0"/>
+          <w14:ligatures w14:val="none"/>
+        </w:rPr>
+      </w:pPr>
+      <w:r>
+        <w:rPr>
+          <w:rFonts w:eastAsia="Times New Roman" w:cs="Arial"/>
+          <w:color w:val="000000"/>
+          <w:kern w:val="0"/>
+          <w14:ligatures w14:val="none"/>
+        </w:rPr>
+        <w:t>CEP: 13455-707 – Santa Bárbara d’Oeste/SP</w:t>
+      </w:r>
+    </w:p>
+    <w:p>
+      <w:pPr>
+        <w:spacing w:after="0" w:line="276" w:lineRule="auto"/>
+        <w:jc w:val="both"/>
+        <w:rPr>
+          <w:rFonts w:eastAsia="MS Mincho" w:cs="Arial"/>
+          <w:kern w:val="0"/>
+          <w:szCs w:val="22"/>
+          <w14:ligatures w14:val="none"/>
+        </w:rPr>
+      </w:pPr>
+    </w:p>
+    <w:p>
+      <w:pPr>
+        <w:spacing w:after="0" w:line="276" w:lineRule="auto"/>
+        <w:jc w:val="both"/>
+        <w:rPr>
+          <w:rFonts w:eastAsia="MS Mincho" w:cs="Arial"/>
+          <w:kern w:val="0"/>
+          <w:szCs w:val="22"/>
+          <w14:ligatures w14:val="none"/>
+        </w:rPr>
+      </w:pPr>
+      <w:r>
+        <w:rPr>
+          <w:rFonts w:eastAsia="MS Mincho" w:cs="Arial"/>
+          <w:kern w:val="0"/>
+          <w:szCs w:val="22"/>
+          <w14:ligatures w14:val="none"/>
+        </w:rPr>
+        <w:t>À</w:t>
+      </w:r>
+    </w:p>
+    <w:p>
+      <w:pPr>
+        <w:spacing w:after="0" w:line="276" w:lineRule="auto"/>
+        <w:jc w:val="both"/>
+        <w:rPr>
+          <w:rFonts w:eastAsia="MS Mincho" w:cs="Arial"/>
+          <w:b/>
+          <w:bCs/>
+          <w:kern w:val="0"/>
+          <w:szCs w:val="22"/>
+          <w14:ligatures w14:val="none"/>
+        </w:rPr>
+      </w:pPr>
+      <w:r>
+        <w:rPr>
+          <w:rFonts w:eastAsia="MS Mincho" w:cs="Arial"/>
+          <w:b/>
+          <w:bCs/>
+          <w:kern w:val="0"/>
+          <w:szCs w:val="22"/>
+          <w14:ligatures w14:val="none"/>
+        </w:rPr>
+        <w:t>SECRETARIA MUNICIPAL DE SEGURANÇA, TRÂNSITO E DEFESA CIVIL</w:t>
+      </w:r>
+    </w:p>
+    <w:p>
+      <w:pPr>
+        <w:spacing w:after="0" w:line="276" w:lineRule="auto"/>
+        <w:jc w:val="both"/>
+        <w:rPr>
+          <w:rFonts w:eastAsia="MS Mincho" w:cs="Arial"/>
+          <w:kern w:val="0"/>
+          <w:szCs w:val="22"/>
+          <w:u w:val="single"/>
+          <w14:ligatures w14:val="none"/>
+        </w:rPr>
+      </w:pPr>
+      <w:r>
+        <w:rPr>
+          <w:rFonts w:eastAsia="MS Mincho" w:cs="Arial"/>
+          <w:kern w:val="0"/>
+          <w:szCs w:val="22"/>
+          <w:u w:val="single"/>
+          <w14:ligatures w14:val="none"/>
+        </w:rPr>
+        <w:t>Rua Curitiba, nº 259 – Jardim Pérola</w:t>
+      </w:r>
+    </w:p>
+    <w:p>
+      <w:pPr>
+        <w:spacing w:after="0" w:line="276" w:lineRule="auto"/>
+        <w:jc w:val="both"/>
+        <w:rPr>
+          <w:rFonts w:eastAsia="MS Mincho" w:cs="Arial"/>
+          <w:kern w:val="0"/>
+          <w:szCs w:val="22"/>
+          <w14:ligatures w14:val="none"/>
+        </w:rPr>
+      </w:pPr>
+      <w:r>
+        <w:rPr>
+          <w:rFonts w:eastAsia="MS Mincho" w:cs="Arial"/>
+          <w:kern w:val="0"/>
+          <w:szCs w:val="22"/>
+          <w14:ligatures w14:val="none"/>
+        </w:rPr>
+        <w:t>CEP: 13454-056 – Santa Bárbara d’Oeste/SP</w:t>
+      </w:r>
+    </w:p>
+    <w:p>
+      <w:pPr>
+        <w:spacing w:after="0" w:line="276" w:lineRule="auto"/>
+        <w:jc w:val="both"/>
+        <w:rPr>
+          <w:rFonts w:eastAsia="MS Mincho" w:cs="Arial"/>
+          <w:kern w:val="0"/>
+          <w:szCs w:val="22"/>
+          <w14:ligatures w14:val="none"/>
+        </w:rPr>
+      </w:pPr>
+    </w:p>
+    <w:p>
+      <w:pPr>
+        <w:spacing w:after="0" w:line="276" w:lineRule="auto"/>
+        <w:jc w:val="both"/>
+        <w:rPr>
+          <w:rFonts w:eastAsia="MS Mincho" w:cs="Arial"/>
+          <w:kern w:val="0"/>
+          <w:szCs w:val="22"/>
+          <w14:ligatures w14:val="none"/>
+        </w:rPr>
+      </w:pPr>
+      <w:r>
+        <w:rPr>
+          <w:rFonts w:eastAsia="MS Mincho" w:cs="Arial"/>
+          <w:kern w:val="0"/>
+          <w:szCs w:val="22"/>
+          <w14:ligatures w14:val="none"/>
+        </w:rPr>
+        <w:t>Ao Reverendíssimo Senhor</w:t>
+      </w:r>
+    </w:p>
+    <w:p>
+      <w:pPr>
+        <w:spacing w:after="0" w:line="276" w:lineRule="auto"/>
+        <w:jc w:val="both"/>
+        <w:rPr>
+          <w:rFonts w:eastAsia="MS Mincho" w:cs="Arial"/>
+          <w:b/>
+          <w:bCs/>
+          <w:kern w:val="0"/>
+          <w:szCs w:val="22"/>
+          <w14:ligatures w14:val="none"/>
+        </w:rPr>
+      </w:pPr>
+      <w:r>
+        <w:rPr>
+          <w:rFonts w:eastAsia="MS Mincho" w:cs="Arial"/>
+          <w:b/>
+          <w:bCs/>
+          <w:kern w:val="0"/>
+          <w:szCs w:val="22"/>
+          <w14:ligatures w14:val="none"/>
+        </w:rPr>
+        <w:t>BISPO VALNEI</w:t>
+      </w:r>
+    </w:p>
+    <w:p>
+      <w:pPr>
+        <w:spacing w:after="0" w:line="276" w:lineRule="auto"/>
+        <w:jc w:val="both"/>
+        <w:rPr>
+          <w:rFonts w:eastAsia="MS Mincho" w:cs="Arial"/>
+          <w:b/>
+          <w:bCs/>
+          <w:kern w:val="0"/>
+          <w:szCs w:val="22"/>
+          <w14:ligatures w14:val="none"/>
+        </w:rPr>
+      </w:pPr>
+      <w:r>
+        <w:rPr>
+          <w:rFonts w:eastAsia="MS Mincho" w:cs="Arial"/>
+          <w:b/>
+          <w:bCs/>
+          <w:kern w:val="0"/>
+          <w:szCs w:val="22"/>
+          <w14:ligatures w14:val="none"/>
+        </w:rPr>
+        <w:t>IGREJA MUNDIAL O CRISTO</w:t>
+      </w:r>
+    </w:p>
+    <w:p>
+      <w:pPr>
+        <w:spacing w:after="0" w:line="276" w:lineRule="auto"/>
+        <w:jc w:val="both"/>
+        <w:rPr>
+          <w:rFonts w:eastAsia="MS Mincho" w:cs="Arial"/>
+          <w:kern w:val="0"/>
+          <w:szCs w:val="22"/>
+          <w:u w:val="single"/>
+          <w14:ligatures w14:val="none"/>
+        </w:rPr>
+      </w:pPr>
+      <w:r>
+        <w:rPr>
+          <w:rFonts w:eastAsia="MS Mincho" w:cs="Arial"/>
+          <w:kern w:val="0"/>
+          <w:szCs w:val="22"/>
+          <w:u w:val="single"/>
+          <w14:ligatures w14:val="none"/>
+        </w:rPr>
+        <w:lastRenderedPageBreak/>
+        <w:t>Rua Romarinho Franchi, n° 112, no bairro Dona Regina</w:t>
+      </w:r>
+    </w:p>
+    <w:p>
+      <w:pPr>
+        <w:spacing w:after="0" w:line="276" w:lineRule="auto"/>
+        <w:jc w:val="both"/>
+        <w:rPr>
+          <w:rFonts w:eastAsia="MS Mincho" w:cs="Arial"/>
+          <w:kern w:val="0"/>
+          <w:szCs w:val="22"/>
+          <w14:ligatures w14:val="none"/>
+        </w:rPr>
+      </w:pPr>
+    </w:p>
+    <w:p>
+      <w:pPr>
+        <w:spacing w:after="0" w:line="276" w:lineRule="auto"/>
+        <w:jc w:val="both"/>
+        <w:rPr>
+          <w:rFonts w:eastAsia="MS Mincho" w:cs="Arial"/>
+          <w:kern w:val="0"/>
+          <w:szCs w:val="22"/>
+          <w14:ligatures w14:val="none"/>
+        </w:rPr>
+      </w:pPr>
+      <w:r>
+        <w:rPr>
+          <w:rFonts w:eastAsia="MS Mincho" w:cs="Arial"/>
+          <w:kern w:val="0"/>
+          <w:szCs w:val="22"/>
+          <w14:ligatures w14:val="none"/>
+        </w:rPr>
+        <w:t>Ao Senhor</w:t>
+      </w:r>
+    </w:p>
+    <w:p>
+      <w:pPr>
+        <w:spacing w:after="0" w:line="276" w:lineRule="auto"/>
+        <w:jc w:val="both"/>
+        <w:rPr>
+          <w:rFonts w:eastAsia="MS Mincho" w:cs="Arial"/>
+          <w:b/>
+          <w:kern w:val="0"/>
+          <w:szCs w:val="22"/>
+          <w14:ligatures w14:val="none"/>
+        </w:rPr>
+      </w:pPr>
+      <w:r>
+        <w:rPr>
+          <w:rFonts w:eastAsia="MS Mincho" w:cs="Arial"/>
+          <w:b/>
+          <w:kern w:val="0"/>
+          <w:szCs w:val="22"/>
+          <w14:ligatures w14:val="none"/>
+        </w:rPr>
+        <w:t>DANILO LUIZ DEZAN</w:t>
+      </w:r>
+    </w:p>
+    <w:p>
+      <w:pPr>
+        <w:spacing w:after="0" w:line="276" w:lineRule="auto"/>
+        <w:jc w:val="both"/>
+        <w:rPr>
+          <w:rFonts w:eastAsia="MS Mincho" w:cs="Arial"/>
+          <w:b/>
+          <w:kern w:val="0"/>
+          <w:szCs w:val="22"/>
+          <w14:ligatures w14:val="none"/>
+        </w:rPr>
+      </w:pPr>
+      <w:r>
+        <w:rPr>
+          <w:rFonts w:eastAsia="MS Mincho" w:cs="Arial"/>
+          <w:b/>
+          <w:kern w:val="0"/>
+          <w:szCs w:val="22"/>
+          <w14:ligatures w14:val="none"/>
+        </w:rPr>
+        <w:t>Diretor Regional</w:t>
+      </w:r>
+    </w:p>
+    <w:p>
+      <w:pPr>
+        <w:spacing w:after="0" w:line="276" w:lineRule="auto"/>
+        <w:jc w:val="both"/>
+        <w:rPr>
+          <w:rFonts w:eastAsia="MS Mincho" w:cs="Arial"/>
+          <w:b/>
+          <w:kern w:val="0"/>
+          <w:szCs w:val="22"/>
+          <w14:ligatures w14:val="none"/>
+        </w:rPr>
+      </w:pPr>
+      <w:r>
+        <w:rPr>
+          <w:rFonts w:eastAsia="MS Mincho" w:cs="Arial"/>
+          <w:b/>
+          <w:kern w:val="0"/>
+          <w:szCs w:val="22"/>
+          <w14:ligatures w14:val="none"/>
+        </w:rPr>
+        <w:t>DER – Departamento de Estradas de Rodagem</w:t>
+      </w:r>
+    </w:p>
+    <w:p>
+      <w:pPr>
+        <w:spacing w:after="0" w:line="276" w:lineRule="auto"/>
+        <w:jc w:val="both"/>
+        <w:rPr>
+          <w:rFonts w:eastAsia="MS Mincho" w:cs="Arial"/>
+          <w:b/>
+          <w:kern w:val="0"/>
+          <w:szCs w:val="22"/>
+          <w14:ligatures w14:val="none"/>
+        </w:rPr>
+      </w:pPr>
+      <w:r>
+        <w:rPr>
+          <w:rFonts w:eastAsia="MS Mincho" w:cs="Arial"/>
+          <w:b/>
+          <w:kern w:val="0"/>
+          <w:szCs w:val="22"/>
+          <w14:ligatures w14:val="none"/>
+        </w:rPr>
+        <w:t>Divisão Regional de Rio Claro</w:t>
+      </w:r>
+    </w:p>
+    <w:p>
+      <w:pPr>
+        <w:spacing w:after="0" w:line="276" w:lineRule="auto"/>
+        <w:jc w:val="both"/>
+        <w:rPr>
+          <w:rFonts w:eastAsia="MS Mincho" w:cs="Arial"/>
+          <w:kern w:val="0"/>
+          <w:szCs w:val="22"/>
+          <w:u w:val="single"/>
+          <w14:ligatures w14:val="none"/>
+        </w:rPr>
+      </w:pPr>
+      <w:r>
+        <w:rPr>
+          <w:rFonts w:eastAsia="MS Mincho" w:cs="Arial"/>
+          <w:kern w:val="0"/>
+          <w:szCs w:val="22"/>
+          <w:u w:val="single"/>
+          <w14:ligatures w14:val="none"/>
+        </w:rPr>
+        <w:t>Avenida da Saudade, nº 37 – Centro</w:t>
+      </w:r>
+    </w:p>
+    <w:p>
+      <w:pPr>
+        <w:spacing w:after="0" w:line="276" w:lineRule="auto"/>
+        <w:jc w:val="both"/>
+        <w:rPr>
+          <w:rFonts w:eastAsia="MS Mincho" w:cs="Arial"/>
+          <w:kern w:val="0"/>
+          <w:szCs w:val="22"/>
+          <w14:ligatures w14:val="none"/>
+        </w:rPr>
+      </w:pPr>
+      <w:r>
+        <w:rPr>
+          <w:rFonts w:eastAsia="MS Mincho" w:cs="Arial"/>
+          <w:kern w:val="0"/>
+          <w:szCs w:val="22"/>
+          <w14:ligatures w14:val="none"/>
+        </w:rPr>
+        <w:t>CEP: 13500-300 – Rio Claro/SP</w:t>
+      </w:r>
+    </w:p>
+    <w:p>
+      <w:pPr>
+        <w:spacing w:after="0" w:line="240" w:lineRule="auto"/>
+        <w:jc w:val="both"/>
+        <w:rPr>
+          <w:rFonts w:eastAsia="Times New Roman" w:cs="Arial"/>
+          <w:color w:val="0000FF"/>
+          <w:kern w:val="0"/>
+          <w:u w:val="single"/>
+          <w:lang w:val="en-US" w:eastAsia="pt-BR"/>
+          <w14:ligatures w14:val="none"/>
+        </w:rPr>
+      </w:pPr>
+      <w:hyperlink r:id="rId6" w:history="1">
+        <w:r>
+          <w:rPr>
+            <w:rFonts w:eastAsia="Times New Roman"/>
+            <w:color w:val="0000FF"/>
+            <w:u w:val="single"/>
+            <w:lang w:val="en-US" w:eastAsia="pt-BR"/>
+          </w:rPr>
+          <w:t>cgr13-der@der.sp.gov.br</w:t>
+        </w:r>
+      </w:hyperlink>
+    </w:p>
+    <w:p>
+      <w:pPr>
+        <w:spacing w:after="0" w:line="276" w:lineRule="auto"/>
+        <w:jc w:val="both"/>
+        <w:rPr>
+          <w:rFonts w:eastAsia="MS Mincho" w:cs="Arial"/>
+          <w:kern w:val="0"/>
+          <w:szCs w:val="22"/>
+          <w14:ligatures w14:val="none"/>
+        </w:rPr>
+      </w:pPr>
+    </w:p>
+    <w:p>
+      <w:pPr>
+        <w:spacing w:after="0" w:line="276" w:lineRule="auto"/>
+        <w:jc w:val="both"/>
+        <w:rPr>
+          <w:rFonts w:eastAsia="MS Mincho" w:cs="Arial"/>
+          <w:kern w:val="0"/>
+          <w:szCs w:val="22"/>
+          <w14:ligatures w14:val="none"/>
+        </w:rPr>
+      </w:pPr>
+      <w:r>
+        <w:rPr>
+          <w:rFonts w:eastAsia="MS Mincho" w:cs="Arial"/>
+          <w:kern w:val="0"/>
+          <w:szCs w:val="22"/>
+          <w14:ligatures w14:val="none"/>
+        </w:rPr>
+        <w:t>Ao</w:t>
+      </w:r>
+    </w:p>
+    <w:p>
+      <w:pPr>
+        <w:spacing w:after="0" w:line="276" w:lineRule="auto"/>
+        <w:jc w:val="both"/>
+        <w:rPr>
+          <w:rFonts w:eastAsia="MS Mincho" w:cs="Arial"/>
+          <w:b/>
+          <w:bCs/>
+          <w:kern w:val="0"/>
+          <w:szCs w:val="22"/>
+          <w14:ligatures w14:val="none"/>
+        </w:rPr>
+      </w:pPr>
+      <w:r>
+        <w:rPr>
+          <w:rFonts w:eastAsia="MS Mincho" w:cs="Arial"/>
+          <w:b/>
+          <w:bCs/>
+          <w:kern w:val="0"/>
+          <w:szCs w:val="22"/>
+          <w14:ligatures w14:val="none"/>
+        </w:rPr>
+        <w:t>19º BPM/I</w:t>
+      </w:r>
+    </w:p>
+    <w:p>
+      <w:pPr>
+        <w:spacing w:after="0" w:line="276" w:lineRule="auto"/>
+        <w:jc w:val="both"/>
+        <w:rPr>
+          <w:rFonts w:eastAsia="MS Mincho" w:cs="Arial"/>
+          <w:b/>
+          <w:bCs/>
+          <w:kern w:val="0"/>
+          <w:szCs w:val="22"/>
+          <w14:ligatures w14:val="none"/>
+        </w:rPr>
+      </w:pPr>
+      <w:r>
+        <w:rPr>
+          <w:rFonts w:eastAsia="MS Mincho" w:cs="Arial"/>
+          <w:b/>
+          <w:bCs/>
+          <w:kern w:val="0"/>
+          <w:szCs w:val="22"/>
+          <w14:ligatures w14:val="none"/>
+        </w:rPr>
+        <w:t>2ª COMPANHIA DA POLÍCIA MILITAR DO ESTADO DE SÃO PAULO</w:t>
+      </w:r>
+    </w:p>
+    <w:p>
+      <w:pPr>
+        <w:spacing w:after="0" w:line="276" w:lineRule="auto"/>
+        <w:jc w:val="both"/>
+        <w:rPr>
+          <w:rFonts w:eastAsia="MS Mincho" w:cs="Arial"/>
+          <w:kern w:val="0"/>
+          <w:szCs w:val="22"/>
+          <w:u w:val="single"/>
+          <w14:ligatures w14:val="none"/>
+        </w:rPr>
+      </w:pPr>
+      <w:r>
+        <w:rPr>
+          <w:rFonts w:eastAsia="MS Mincho" w:cs="Arial"/>
+          <w:kern w:val="0"/>
+          <w:szCs w:val="22"/>
+          <w:u w:val="single"/>
+          <w14:ligatures w14:val="none"/>
+        </w:rPr>
+        <w:t>Rua Maranhão, nº 290 – Vila Brasil</w:t>
+      </w:r>
+    </w:p>
+    <w:p>
+      <w:pPr>
+        <w:spacing w:after="0" w:line="276" w:lineRule="auto"/>
+        <w:jc w:val="both"/>
+        <w:rPr>
+          <w:rFonts w:eastAsia="MS Mincho" w:cs="Arial"/>
+          <w:kern w:val="0"/>
+          <w:szCs w:val="22"/>
+          <w14:ligatures w14:val="none"/>
+        </w:rPr>
+      </w:pPr>
+      <w:r>
+        <w:rPr>
+          <w:rFonts w:eastAsia="MS Mincho" w:cs="Arial"/>
+          <w:kern w:val="0"/>
+          <w:szCs w:val="22"/>
+          <w14:ligatures w14:val="none"/>
+        </w:rPr>
+        <w:t>CEP: 13451-082 – Santa Bárbara d’Oeste/SP</w:t>
+      </w:r>
+    </w:p>
+    <w:p>
+      <w:pPr>
+        <w:spacing w:after="0" w:line="240" w:lineRule="auto"/>
+        <w:jc w:val="both"/>
+        <w:rPr>
+          <w:rFonts w:eastAsia="Times New Roman"/>
+          <w:color w:val="0000FF"/>
+          <w:u w:val="single"/>
+          <w:lang w:val="en-US" w:eastAsia="pt-BR"/>
+        </w:rPr>
+      </w:pPr>
+      <w:hyperlink r:id="rId7" w:history="1">
+        <w:r>
+          <w:rPr>
+            <w:rFonts w:eastAsia="Times New Roman"/>
+            <w:color w:val="0000FF"/>
+            <w:u w:val="single"/>
+            <w:lang w:val="en-US" w:eastAsia="pt-BR"/>
+          </w:rPr>
+          <w:t>19bpmi2ciap3@policiamilitar.sp.gov.br</w:t>
+        </w:r>
+      </w:hyperlink>
+    </w:p>
+    <w:p>
+      <w:pPr>
+        <w:spacing w:after="0" w:line="240" w:lineRule="auto"/>
+        <w:rPr>
+          <w:lang w:eastAsia="pt-BR"/>
+        </w:rPr>
+      </w:pPr>
+    </w:p>
+    <w:p>
+      <w:pPr>
+        <w:spacing w:after="0" w:line="240" w:lineRule="auto"/>
+        <w:rPr>
+          <w:lang w:eastAsia="pt-BR"/>
+        </w:rPr>
+      </w:pPr>
+      <w:r>
+        <w:rPr>
+          <w:lang w:eastAsia="pt-BR"/>
+        </w:rPr>
+        <w:t>A Sua Excelência o Senhor</w:t>
+      </w:r>
+    </w:p>
+    <w:p>
+      <w:pPr>
+        <w:spacing w:after="0" w:line="240" w:lineRule="auto"/>
+        <w:rPr>
+          <w:b/>
+          <w:bCs/>
+          <w:lang w:eastAsia="pt-BR"/>
+        </w:rPr>
+      </w:pPr>
+      <w:r>
+        <w:rPr>
+          <w:b/>
+          <w:bCs/>
+          <w:lang w:eastAsia="pt-BR"/>
+        </w:rPr>
+        <w:t>ELEUSES PAIVA</w:t>
+      </w:r>
+    </w:p>
+    <w:p>
+      <w:pPr>
+        <w:spacing w:after="0" w:line="240" w:lineRule="auto"/>
+        <w:rPr>
+          <w:lang w:eastAsia="pt-BR"/>
+        </w:rPr>
+      </w:pPr>
+      <w:r>
+        <w:rPr>
+          <w:lang w:eastAsia="pt-BR"/>
+        </w:rPr>
+        <w:t>Secretário de Saúde do Estado de São Paulo</w:t>
+      </w:r>
+    </w:p>
+    <w:p>
+      <w:pPr>
+        <w:spacing w:after="0" w:line="240" w:lineRule="auto"/>
+        <w:rPr>
+          <w:u w:val="single"/>
+          <w:lang w:eastAsia="pt-BR"/>
+        </w:rPr>
+      </w:pPr>
+      <w:r>
+        <w:rPr>
+          <w:u w:val="single"/>
+          <w:lang w:eastAsia="pt-BR"/>
+        </w:rPr>
+        <w:t>Avenida Dr. Eneas Carvalho de Aguiar, nº 188 – Cerqueira César</w:t>
+      </w:r>
+    </w:p>
+    <w:p>
+      <w:pPr>
+        <w:spacing w:after="0" w:line="240" w:lineRule="auto"/>
+        <w:rPr>
+          <w:lang w:eastAsia="pt-BR"/>
+        </w:rPr>
+      </w:pPr>
+      <w:r>
+        <w:rPr>
+          <w:lang w:eastAsia="pt-BR"/>
+        </w:rPr>
+        <w:t>CEP 05403-000 – São Paulo/SP</w:t>
+      </w:r>
+    </w:p>
+    <w:p>
+      <w:pPr>
+        <w:spacing w:after="0" w:line="240" w:lineRule="auto"/>
+        <w:jc w:val="both"/>
+        <w:rPr>
+          <w:rFonts w:eastAsia="Times New Roman"/>
+          <w:color w:val="0000FF"/>
+          <w:u w:val="single"/>
+          <w:lang w:val="en-US" w:eastAsia="pt-BR"/>
+        </w:rPr>
+      </w:pPr>
+      <w:hyperlink r:id="rId8" w:history="1">
+        <w:r>
+          <w:rPr>
+            <w:rFonts w:eastAsia="Times New Roman"/>
+            <w:color w:val="0000FF"/>
+            <w:u w:val="single"/>
+            <w:lang w:val="en-US" w:eastAsia="pt-BR"/>
           </w:rPr>
           <w:t>imprensa@saude.sp.gov.br</w:t>
         </w:r>
@@ -133,8 +1540,14 @@
     <w:p>
       <w:pPr>
         <w:spacing w:after="0" w:line="240" w:lineRule="auto"/>
-      </w:pPr>
-      <w:r>
+        <w:rPr>
+          <w:u w:val="single"/>
+        </w:rPr>
+      </w:pPr>
+      <w:r>
+        <w:rPr>
+          <w:u w:val="single"/>
+        </w:rPr>
         <w:t>Praça dos Três Poderes, Palácio do Planalto</w:t>
       </w:r>
     </w:p>
@@ -192,8 +1605,14 @@
     <w:p>
       <w:pPr>
         <w:spacing w:after="0" w:line="240" w:lineRule="auto"/>
-      </w:pPr>
-      <w:r>
+        <w:rPr>
+          <w:u w:val="single"/>
+        </w:rPr>
+      </w:pPr>
+      <w:r>
+        <w:rPr>
+          <w:u w:val="single"/>
+        </w:rPr>
         <w:t>Esplanada dos Ministérios - Bloco A, Sala T23 - Plano Piloto</w:t>
       </w:r>
     </w:p>
@@ -214,15 +1633,21 @@
     <w:p>
       <w:pPr>
         <w:spacing w:after="0" w:line="240" w:lineRule="auto"/>
-        <w:rPr>
-          <w:lang w:val="en-US"/>
-        </w:rPr>
-      </w:pPr>
-      <w:hyperlink r:id="rId5" w:history="1">
+        <w:jc w:val="both"/>
+        <w:rPr>
+          <w:rFonts w:eastAsia="Times New Roman"/>
+          <w:color w:val="0000FF"/>
+          <w:u w:val="single"/>
+          <w:lang w:val="en-US" w:eastAsia="pt-BR"/>
+        </w:rPr>
+      </w:pPr>
+      <w:hyperlink r:id="rId9" w:history="1">
         <w:r>
           <w:rPr>
-            <w:rStyle w:val="Hyperlink"/>
-            <w:lang w:val="en-US"/>
+            <w:rFonts w:eastAsia="Times New Roman"/>
+            <w:color w:val="0000FF"/>
+            <w:u w:val="single"/>
+            <w:lang w:val="en-US" w:eastAsia="pt-BR"/>
           </w:rPr>
           <w:t>ricardo.felix@mds.gov.br</w:t>
         </w:r>
@@ -271,8 +1696,14 @@
     <w:p>
       <w:pPr>
         <w:spacing w:after="0" w:line="240" w:lineRule="auto"/>
-      </w:pPr>
-      <w:r>
+        <w:rPr>
+          <w:u w:val="single"/>
+        </w:rPr>
+      </w:pPr>
+      <w:r>
+        <w:rPr>
+          <w:u w:val="single"/>
+        </w:rPr>
         <w:t>Esplanada dos Ministérios – Bloco G Térreo – Edifício Sede</w:t>
       </w:r>
     </w:p>
@@ -305,15 +1736,21 @@
     <w:p>
       <w:pPr>
         <w:spacing w:after="0" w:line="240" w:lineRule="auto"/>
-        <w:rPr>
-          <w:lang w:val="en-US"/>
-        </w:rPr>
-      </w:pPr>
-      <w:hyperlink r:id="rId6" w:history="1">
+        <w:jc w:val="both"/>
+        <w:rPr>
+          <w:rFonts w:eastAsia="Times New Roman"/>
+          <w:color w:val="0000FF"/>
+          <w:u w:val="single"/>
+          <w:lang w:val="en-US" w:eastAsia="pt-BR"/>
+        </w:rPr>
+      </w:pPr>
+      <w:hyperlink r:id="rId10" w:history="1">
         <w:r>
           <w:rPr>
-            <w:rStyle w:val="Hyperlink"/>
-            <w:lang w:val="en-US"/>
+            <w:rFonts w:eastAsia="Times New Roman"/>
+            <w:color w:val="0000FF"/>
+            <w:u w:val="single"/>
+            <w:lang w:val="en-US" w:eastAsia="pt-BR"/>
           </w:rPr>
           <w:t>gabinetedoministro@saude.gov.br</w:t>
         </w:r>
@@ -348,6 +1785,7 @@
           <w:b/>
           <w:bCs/>
         </w:rPr>
+        <w:lastRenderedPageBreak/>
         <w:t>TARCÍSIO DE FREITAS</w:t>
       </w:r>
     </w:p>
@@ -370,8 +1808,14 @@
     <w:p>
       <w:pPr>
         <w:spacing w:after="0" w:line="240" w:lineRule="auto"/>
-      </w:pPr>
-      <w:r>
+        <w:rPr>
+          <w:u w:val="single"/>
+        </w:rPr>
+      </w:pPr>
+      <w:r>
+        <w:rPr>
+          <w:u w:val="single"/>
+        </w:rPr>
         <w:t xml:space="preserve">Av. Morumbi, nº 4.500, Morumbi </w:t>
       </w:r>
     </w:p>
@@ -386,11 +1830,21 @@
     <w:p>
       <w:pPr>
         <w:spacing w:after="0" w:line="240" w:lineRule="auto"/>
-      </w:pPr>
-      <w:hyperlink r:id="rId7" w:history="1">
+        <w:jc w:val="both"/>
+        <w:rPr>
+          <w:rFonts w:eastAsia="Times New Roman"/>
+          <w:color w:val="0000FF"/>
+          <w:u w:val="single"/>
+          <w:lang w:val="en-US" w:eastAsia="pt-BR"/>
+        </w:rPr>
+      </w:pPr>
+      <w:hyperlink r:id="rId11" w:history="1">
         <w:r>
           <w:rPr>
-            <w:rStyle w:val="Hyperlink"/>
+            <w:rFonts w:eastAsia="Times New Roman"/>
+            <w:color w:val="0000FF"/>
+            <w:u w:val="single"/>
+            <w:lang w:val="en-US" w:eastAsia="pt-BR"/>
           </w:rPr>
           <w:t>gabinetedogovernador@sp.gov.br</w:t>
         </w:r>
@@ -436,8 +1890,14 @@
     <w:p>
       <w:pPr>
         <w:spacing w:after="0" w:line="240" w:lineRule="auto"/>
-      </w:pPr>
-      <w:r>
+        <w:rPr>
+          <w:u w:val="single"/>
+        </w:rPr>
+      </w:pPr>
+      <w:r>
+        <w:rPr>
+          <w:u w:val="single"/>
+        </w:rPr>
         <w:t>Avenida Auro Soares de Moura Andrade, nº 564, Portão 10 – Barra Funda</w:t>
       </w:r>
     </w:p>
@@ -452,11 +1912,21 @@
     <w:p>
       <w:pPr>
         <w:spacing w:after="0" w:line="240" w:lineRule="auto"/>
-      </w:pPr>
-      <w:hyperlink r:id="rId8" w:history="1">
+        <w:jc w:val="both"/>
+        <w:rPr>
+          <w:rFonts w:eastAsia="Times New Roman"/>
+          <w:color w:val="0000FF"/>
+          <w:u w:val="single"/>
+          <w:lang w:val="en-US" w:eastAsia="pt-BR"/>
+        </w:rPr>
+      </w:pPr>
+      <w:hyperlink r:id="rId12" w:history="1">
         <w:r>
           <w:rPr>
-            <w:rStyle w:val="Hyperlink"/>
+            <w:rFonts w:eastAsia="Times New Roman"/>
+            <w:color w:val="0000FF"/>
+            <w:u w:val="single"/>
+            <w:lang w:val="en-US" w:eastAsia="pt-BR"/>
           </w:rPr>
           <w:t>ouvidoria@sedpcd.sp.gov.br</w:t>
         </w:r>
@@ -502,8 +1972,14 @@
     <w:p>
       <w:pPr>
         <w:spacing w:after="0" w:line="240" w:lineRule="auto"/>
-      </w:pPr>
-      <w:r>
+        <w:rPr>
+          <w:u w:val="single"/>
+        </w:rPr>
+      </w:pPr>
+      <w:r>
+        <w:rPr>
+          <w:u w:val="single"/>
+        </w:rPr>
         <w:t>Praça da República, nº 53 – Centro</w:t>
       </w:r>
     </w:p>
@@ -518,11 +1994,21 @@
     <w:p>
       <w:pPr>
         <w:spacing w:after="0" w:line="240" w:lineRule="auto"/>
-      </w:pPr>
-      <w:hyperlink r:id="rId9" w:history="1">
+        <w:jc w:val="both"/>
+        <w:rPr>
+          <w:rFonts w:eastAsia="Times New Roman"/>
+          <w:color w:val="0000FF"/>
+          <w:u w:val="single"/>
+          <w:lang w:val="en-US" w:eastAsia="pt-BR"/>
+        </w:rPr>
+      </w:pPr>
+      <w:hyperlink r:id="rId13" w:history="1">
         <w:r>
           <w:rPr>
-            <w:rStyle w:val="Hyperlink"/>
+            <w:rFonts w:eastAsia="Times New Roman"/>
+            <w:color w:val="0000FF"/>
+            <w:u w:val="single"/>
+            <w:lang w:val="en-US" w:eastAsia="pt-BR"/>
           </w:rPr>
           <w:t>imprensa@educacao.sp.gov.br</w:t>
         </w:r>
@@ -531,11 +2017,21 @@
     <w:p>
       <w:pPr>
         <w:spacing w:after="0" w:line="240" w:lineRule="auto"/>
-      </w:pPr>
-      <w:hyperlink r:id="rId10" w:history="1">
+        <w:jc w:val="both"/>
+        <w:rPr>
+          <w:rFonts w:eastAsia="Times New Roman"/>
+          <w:color w:val="0000FF"/>
+          <w:u w:val="single"/>
+          <w:lang w:val="en-US" w:eastAsia="pt-BR"/>
+        </w:rPr>
+      </w:pPr>
+      <w:hyperlink r:id="rId14" w:history="1">
         <w:r>
           <w:rPr>
-            <w:rStyle w:val="Hyperlink"/>
+            <w:rFonts w:eastAsia="Times New Roman"/>
+            <w:color w:val="0000FF"/>
+            <w:u w:val="single"/>
+            <w:lang w:val="en-US" w:eastAsia="pt-BR"/>
           </w:rPr>
           <w:t>agenda.secretario@educacao.sp.gov.br</w:t>
         </w:r>
@@ -577,9 +2073,6 @@
       <w:r>
         <w:t>Prefeito Municipal</w:t>
       </w:r>
-      <w:r>
-        <w:tab/>
-      </w:r>
     </w:p>
     <w:p>
       <w:pPr>
@@ -752,8 +2245,14 @@
     <w:p>
       <w:pPr>
         <w:spacing w:after="0" w:line="240" w:lineRule="auto"/>
-      </w:pPr>
-      <w:r>
+        <w:rPr>
+          <w:u w:val="single"/>
+        </w:rPr>
+      </w:pPr>
+      <w:r>
+        <w:rPr>
+          <w:u w:val="single"/>
+        </w:rPr>
         <w:t>Praça dos Três Poderes</w:t>
       </w:r>
     </w:p>
@@ -768,11 +2267,21 @@
     <w:p>
       <w:pPr>
         <w:spacing w:after="0" w:line="240" w:lineRule="auto"/>
-      </w:pPr>
-      <w:hyperlink r:id="rId11" w:history="1">
+        <w:jc w:val="both"/>
+        <w:rPr>
+          <w:rFonts w:eastAsia="Times New Roman"/>
+          <w:color w:val="0000FF"/>
+          <w:u w:val="single"/>
+          <w:lang w:val="en-US" w:eastAsia="pt-BR"/>
+        </w:rPr>
+      </w:pPr>
+      <w:hyperlink r:id="rId15" w:history="1">
         <w:r>
           <w:rPr>
-            <w:rStyle w:val="Hyperlink"/>
+            <w:rFonts w:eastAsia="Times New Roman"/>
+            <w:color w:val="0000FF"/>
+            <w:u w:val="single"/>
+            <w:lang w:val="en-US" w:eastAsia="pt-BR"/>
           </w:rPr>
           <w:t>dep.marcospereira@camara.leg.br</w:t>
         </w:r>
@@ -814,8 +2323,14 @@
     <w:p>
       <w:pPr>
         <w:spacing w:after="0" w:line="240" w:lineRule="auto"/>
-      </w:pPr>
-      <w:r>
+        <w:rPr>
+          <w:u w:val="single"/>
+        </w:rPr>
+      </w:pPr>
+      <w:r>
+        <w:rPr>
+          <w:u w:val="single"/>
+        </w:rPr>
         <w:t>Rua Boa Vista, nº 209 – Centro Histórico de São Paulo</w:t>
       </w:r>
     </w:p>
@@ -837,58 +2352,182 @@
         <w:spacing w:after="0" w:line="240" w:lineRule="auto"/>
       </w:pPr>
       <w:r>
-        <w:t>À</w:t>
-      </w:r>
-    </w:p>
-    <w:p>
-      <w:pPr>
-        <w:spacing w:after="0" w:line="240" w:lineRule="auto"/>
-        <w:rPr>
-          <w:b/>
-          <w:bCs/>
-        </w:rPr>
-      </w:pPr>
-      <w:r>
-        <w:rPr>
-          <w:b/>
-          <w:bCs/>
-        </w:rPr>
-        <w:t>TORCIDA INFERNO BARBARENSE</w:t>
-      </w:r>
-    </w:p>
-    <w:p>
-      <w:pPr>
-        <w:spacing w:after="0" w:line="240" w:lineRule="auto"/>
-      </w:pPr>
-      <w:r>
-        <w:t>Rua Izidoro Aprígio, nº 100 – Bloco 1, Apartamento 001 – Vila Tereza</w:t>
-      </w:r>
-    </w:p>
-    <w:p>
-      <w:pPr>
-        <w:spacing w:after="0" w:line="240" w:lineRule="auto"/>
-      </w:pPr>
-      <w:r>
-        <w:t>CEP: 13450-070 – Santa Bárbara d’Oeste/SP</w:t>
-      </w:r>
-    </w:p>
-    <w:p>
-      <w:pPr>
-        <w:spacing w:after="0" w:line="240" w:lineRule="auto"/>
-      </w:pPr>
-      <w:hyperlink r:id="rId12" w:history="1">
+        <w:lastRenderedPageBreak/>
+        <w:t>Ao Senhor</w:t>
+      </w:r>
+    </w:p>
+    <w:p>
+      <w:pPr>
+        <w:spacing w:after="0" w:line="240" w:lineRule="auto"/>
+        <w:rPr>
+          <w:b/>
+        </w:rPr>
+      </w:pPr>
+      <w:r>
+        <w:rPr>
+          <w:b/>
+        </w:rPr>
+        <w:t>Danilo Luiz Dezan</w:t>
+      </w:r>
+    </w:p>
+    <w:p>
+      <w:pPr>
+        <w:spacing w:after="0" w:line="240" w:lineRule="auto"/>
+        <w:rPr>
+          <w:b/>
+        </w:rPr>
+      </w:pPr>
+      <w:r>
+        <w:rPr>
+          <w:b/>
+        </w:rPr>
+        <w:t>Diretor Regional</w:t>
+      </w:r>
+    </w:p>
+    <w:p>
+      <w:pPr>
+        <w:spacing w:after="0" w:line="240" w:lineRule="auto"/>
+        <w:rPr>
+          <w:b/>
+        </w:rPr>
+      </w:pPr>
+      <w:r>
+        <w:rPr>
+          <w:b/>
+        </w:rPr>
+        <w:t>DER – Departamento de Estradas de Rodagem</w:t>
+      </w:r>
+    </w:p>
+    <w:p>
+      <w:pPr>
+        <w:spacing w:after="0" w:line="240" w:lineRule="auto"/>
+        <w:rPr>
+          <w:b/>
+        </w:rPr>
+      </w:pPr>
+      <w:r>
+        <w:rPr>
+          <w:b/>
+        </w:rPr>
+        <w:t>Divisão Regional de Rio Claro</w:t>
+      </w:r>
+    </w:p>
+    <w:p>
+      <w:pPr>
+        <w:spacing w:after="0" w:line="240" w:lineRule="auto"/>
+        <w:rPr>
+          <w:u w:val="single"/>
+        </w:rPr>
+      </w:pPr>
+      <w:r>
+        <w:rPr>
+          <w:u w:val="single"/>
+        </w:rPr>
+        <w:t>Avenida da Saudade, nº 37 – Centro</w:t>
+      </w:r>
+    </w:p>
+    <w:p>
+      <w:pPr>
+        <w:spacing w:after="0" w:line="240" w:lineRule="auto"/>
+      </w:pPr>
+      <w:r>
+        <w:t>CEP: 13500-300 – Rio Claro/SP</w:t>
+      </w:r>
+    </w:p>
+    <w:p>
+      <w:pPr>
+        <w:spacing w:after="0" w:line="240" w:lineRule="auto"/>
+        <w:jc w:val="both"/>
+        <w:rPr>
+          <w:rFonts w:eastAsia="Times New Roman"/>
+          <w:color w:val="0000FF"/>
+          <w:u w:val="single"/>
+          <w:lang w:val="en-US" w:eastAsia="pt-BR"/>
+        </w:rPr>
+      </w:pPr>
+      <w:hyperlink r:id="rId16" w:history="1">
         <w:r>
           <w:rPr>
-            <w:rStyle w:val="Hyperlink"/>
+            <w:rFonts w:eastAsia="Times New Roman"/>
+            <w:color w:val="0000FF"/>
+            <w:u w:val="single"/>
+            <w:lang w:val="en-US" w:eastAsia="pt-BR"/>
+          </w:rPr>
+          <w:t>ddezan@sp.gov.br</w:t>
+        </w:r>
+      </w:hyperlink>
+    </w:p>
+    <w:p>
+      <w:pPr>
+        <w:spacing w:after="0" w:line="240" w:lineRule="auto"/>
+      </w:pPr>
+    </w:p>
+    <w:p>
+      <w:pPr>
+        <w:spacing w:after="0" w:line="240" w:lineRule="auto"/>
+      </w:pPr>
+      <w:r>
+        <w:t>À</w:t>
+      </w:r>
+    </w:p>
+    <w:p>
+      <w:pPr>
+        <w:spacing w:after="0" w:line="240" w:lineRule="auto"/>
+        <w:rPr>
+          <w:b/>
+          <w:bCs/>
+        </w:rPr>
+      </w:pPr>
+      <w:r>
+        <w:rPr>
+          <w:b/>
+          <w:bCs/>
+        </w:rPr>
+        <w:t>TORCIDA INFERNO BARBARENSE</w:t>
+      </w:r>
+    </w:p>
+    <w:p>
+      <w:pPr>
+        <w:spacing w:after="0" w:line="240" w:lineRule="auto"/>
+        <w:rPr>
+          <w:u w:val="single"/>
+        </w:rPr>
+      </w:pPr>
+      <w:r>
+        <w:rPr>
+          <w:u w:val="single"/>
+        </w:rPr>
+        <w:t>Rua Izidoro Aprígio, nº 100 – Bloco 1, Apartamento 001 – Vila Tereza</w:t>
+      </w:r>
+    </w:p>
+    <w:p>
+      <w:pPr>
+        <w:spacing w:after="0" w:line="240" w:lineRule="auto"/>
+      </w:pPr>
+      <w:r>
+        <w:t>CEP: 13450-070 – Santa Bárbara d’Oeste/SP</w:t>
+      </w:r>
+    </w:p>
+    <w:p>
+      <w:pPr>
+        <w:spacing w:after="0" w:line="240" w:lineRule="auto"/>
+        <w:jc w:val="both"/>
+        <w:rPr>
+          <w:rFonts w:eastAsia="Times New Roman"/>
+          <w:color w:val="0000FF"/>
+          <w:lang w:val="en-US" w:eastAsia="pt-BR"/>
+        </w:rPr>
+      </w:pPr>
+      <w:hyperlink r:id="rId17" w:history="1">
+        <w:r>
+          <w:rPr>
+            <w:rFonts w:eastAsia="Times New Roman"/>
+            <w:color w:val="0000FF"/>
+            <w:lang w:val="en-US" w:eastAsia="pt-BR"/>
           </w:rPr>
           <w:t>torcidainfernobarbarense@gmail.com</w:t>
         </w:r>
       </w:hyperlink>
-    </w:p>
-    <w:p>
-      <w:pPr>
-        <w:spacing w:after="0" w:line="240" w:lineRule="auto"/>
-      </w:pPr>
     </w:p>
     <w:p>
       <w:pPr>

</xml_diff>